<commit_message>
docs(anexo): simplificar roteiro de entrevista com cliente piloto papelaria real
</commit_message>
<xml_diff>
--- a/docs/ANEXO_ENTREVISTA_LEVANTAMENTO_REQUISITOS_PAPELARIA_REAL.docx
+++ b/docs/ANEXO_ENTREVISTA_LEVANTAMENTO_REQUISITOS_PAPELARIA_REAL.docx
@@ -5,7 +5,152 @@
     <w:p>
       <w:pPr>
         <w:jc w:val="center"/>
-        <w:spacing w:before="0" w:after="60" w:line="240" w:lineRule="auto"/>
+        <w:spacing w:before="0" w:after="40" w:line="276" w:lineRule="auto"/>
+      </w:pPr>
+      <w:r>
+        <w:rPr>
+          <w:rFonts w:ascii="Arial" w:hAnsi="Arial"/>
+          <w:b/>
+          <w:color w:val="4B5563"/>
+          <w:sz w:val="21"/>
+        </w:rPr>
+        <w:t>CENTRO ESTADUAL DE EDUCAÇÃO TECNOLÓGICA PAULA SOUZA</w:t>
+      </w:r>
+    </w:p>
+    <w:p>
+      <w:pPr>
+        <w:jc w:val="center"/>
+        <w:spacing w:before="0" w:after="40" w:line="276" w:lineRule="auto"/>
+      </w:pPr>
+      <w:r>
+        <w:rPr>
+          <w:rFonts w:ascii="Arial" w:hAnsi="Arial"/>
+          <w:b/>
+          <w:color w:val="111827"/>
+          <w:sz w:val="23"/>
+        </w:rPr>
+        <w:t>ETEC FERNANDO PRESTES — SOROCABA/SP</w:t>
+      </w:r>
+    </w:p>
+    <w:p>
+      <w:pPr>
+        <w:jc w:val="center"/>
+        <w:spacing w:before="0" w:after="300" w:line="276" w:lineRule="auto"/>
+      </w:pPr>
+      <w:r>
+        <w:rPr>
+          <w:rFonts w:ascii="Arial" w:hAnsi="Arial"/>
+          <w:b w:val="0"/>
+          <w:color w:val="4B5563"/>
+          <w:sz w:val="20"/>
+        </w:rPr>
+        <w:t>CURSO TÉCNICO EM DESENVOLVIMENTO DE SISTEMAS</w:t>
+      </w:r>
+    </w:p>
+    <w:p>
+      <w:pPr>
+        <w:jc w:val="center"/>
+        <w:spacing w:before="1600" w:after="100" w:line="276" w:lineRule="auto"/>
+      </w:pPr>
+      <w:r>
+        <w:rPr>
+          <w:rFonts w:ascii="Arial" w:hAnsi="Arial"/>
+          <w:b/>
+          <w:color w:val="1F2937"/>
+          <w:sz w:val="28"/>
+        </w:rPr>
+        <w:t>ANEXO A</w:t>
+      </w:r>
+    </w:p>
+    <w:p>
+      <w:pPr>
+        <w:jc w:val="center"/>
+        <w:spacing w:before="0" w:after="120" w:line="276" w:lineRule="auto"/>
+      </w:pPr>
+      <w:r>
+        <w:rPr>
+          <w:rFonts w:ascii="Arial" w:hAnsi="Arial"/>
+          <w:b/>
+          <w:color w:val="000000"/>
+          <w:sz w:val="32"/>
+        </w:rPr>
+        <w:t>ROTEIRO DE ENTREVISTA COM O CLIENTE PILOTO</w:t>
+      </w:r>
+    </w:p>
+    <w:p>
+      <w:pPr>
+        <w:jc w:val="center"/>
+        <w:spacing w:before="0" w:after="2000" w:line="276" w:lineRule="auto"/>
+      </w:pPr>
+      <w:r>
+        <w:rPr>
+          <w:rFonts w:ascii="Arial" w:hAnsi="Arial"/>
+          <w:b w:val="0"/>
+          <w:color w:val="4B5563"/>
+          <w:sz w:val="22"/>
+        </w:rPr>
+        <w:t>Levantamento de Requisitos e Rotina Operacional • Papelaria Real Ltda</w:t>
+      </w:r>
+    </w:p>
+    <w:p>
+      <w:pPr>
+        <w:jc w:val="right"/>
+        <w:spacing w:before="0" w:after="2400" w:line="276" w:lineRule="auto"/>
+        <w:ind w:left="4000"/>
+      </w:pPr>
+      <w:r>
+        <w:rPr>
+          <w:rFonts w:ascii="Arial" w:hAnsi="Arial"/>
+          <w:b/>
+          <w:color w:val="111827"/>
+          <w:sz w:val="20"/>
+        </w:rPr>
+        <w:t>Equipe Técnica Mr. Coding:</w:t>
+        <w:br/>
+      </w:r>
+      <w:r>
+        <w:rPr>
+          <w:rFonts w:ascii="Arial" w:hAnsi="Arial"/>
+          <w:b w:val="0"/>
+          <w:color w:val="374151"/>
+          <w:sz w:val="19"/>
+        </w:rPr>
+        <w:t>Cesar Augusto da Silva Junior</w:t>
+        <w:br/>
+        <w:t>Douglas Moraes Braz</w:t>
+        <w:br/>
+        <w:t>Eduardo Sugahara Neto</w:t>
+        <w:br/>
+        <w:t>Enzo de Oliveira Soares</w:t>
+        <w:br/>
+        <w:t>Nikolas Pires Brandão</w:t>
+        <w:br/>
+        <w:br/>
+      </w:r>
+      <w:r>
+        <w:rPr>
+          <w:rFonts w:ascii="Arial" w:hAnsi="Arial"/>
+          <w:b/>
+          <w:color w:val="111827"/>
+          <w:sz w:val="20"/>
+        </w:rPr>
+        <w:t>Orientadores Pedagógicos:</w:t>
+        <w:br/>
+      </w:r>
+      <w:r>
+        <w:rPr>
+          <w:rFonts w:ascii="Arial" w:hAnsi="Arial"/>
+          <w:b w:val="0"/>
+          <w:color w:val="374151"/>
+          <w:sz w:val="19"/>
+        </w:rPr>
+        <w:t>Prof. Luiz Flávio • Prof. Vinicius</w:t>
+      </w:r>
+    </w:p>
+    <w:p>
+      <w:pPr>
+        <w:jc w:val="center"/>
+        <w:spacing w:before="0" w:after="0" w:line="276" w:lineRule="auto"/>
       </w:pPr>
       <w:r>
         <w:rPr>
@@ -14,33 +159,20 @@
           <w:color w:val="4B5563"/>
           <w:sz w:val="20"/>
         </w:rPr>
-        <w:t>CENTRO ESTADUAL DE EDUCAÇÃO TECNOLÓGICA PAULA SOUZA</w:t>
+        <w:t>SOROCABA – SP</w:t>
         <w:br/>
+        <w:t>2026</w:t>
       </w:r>
+    </w:p>
+    <w:p>
       <w:r>
-        <w:rPr>
-          <w:rFonts w:ascii="Arial" w:hAnsi="Arial"/>
-          <w:b/>
-          <w:color w:val="111827"/>
-          <w:sz w:val="22"/>
-        </w:rPr>
-        <w:t>ETEC FERNANDO PRESTES — SOROCABA/SP</w:t>
-        <w:br/>
-      </w:r>
-      <w:r>
-        <w:rPr>
-          <w:rFonts w:ascii="Arial" w:hAnsi="Arial"/>
-          <w:color w:val="4B5563"/>
-          <w:sz w:val="20"/>
-        </w:rPr>
-        <w:t>Curso Técnico em Desenvolvimento de Sistemas • TCC 2026</w:t>
-        <w:br/>
+        <w:br w:type="page"/>
       </w:r>
     </w:p>
     <w:p>
       <w:pPr>
         <w:jc w:val="center"/>
-        <w:spacing w:before="140" w:after="160" w:line="276" w:lineRule="auto"/>
+        <w:spacing w:before="0" w:after="160" w:line="276" w:lineRule="auto"/>
       </w:pPr>
       <w:r>
         <w:rPr>
@@ -49,294 +181,36 @@
           <w:color w:val="000000"/>
           <w:sz w:val="26"/>
         </w:rPr>
-        <w:t>ANEXO A — ROTEIRO DE ENTREVISTA E LEVANTAMENTO DE REQUISITOS COM O CLIENTE PILOTO</w:t>
+        <w:t>ANEXO A — ROTEIRO DE ENTREVISTA COM O CLIENTE PILOTO</w:t>
         <w:br/>
       </w:r>
       <w:r>
         <w:rPr>
           <w:rFonts w:ascii="Arial" w:hAnsi="Arial"/>
           <w:color w:val="4B5563"/>
-          <w:sz w:val="22"/>
+          <w:sz w:val="21"/>
         </w:rPr>
-        <w:t>Validação de Processos de Balcão e Requisitos de Software • Papelaria Real Ltda</w:t>
+        <w:t>Levantamento de Requisitos e Rotina Operacional • Papelaria Real Ltda</w:t>
       </w:r>
     </w:p>
-    <w:tbl>
-      <w:tblPr>
-        <w:tblW w:type="auto" w:w="0"/>
-        <w:jc w:val="center"/>
-        <w:tblLayout w:type="fixed"/>
-        <w:tblLook w:firstColumn="1" w:firstRow="1" w:lastColumn="0" w:lastRow="0" w:noHBand="0" w:noVBand="1" w:val="04A0"/>
-        <w:tblBorders>
-          <w:top w:val="single" w:sz="4" w:space="0" w:color="D1D5DB"/>
-          <w:bottom w:val="single" w:sz="4" w:space="0" w:color="D1D5DB"/>
-          <w:insideH w:val="single" w:sz="4" w:space="0" w:color="E5E7EB"/>
-          <w:insideV w:val="none"/>
-          <w:left w:val="none"/>
-          <w:right w:val="none"/>
-        </w:tblBorders>
-      </w:tblPr>
-      <w:tblGrid>
-        <w:gridCol w:w="4702"/>
-        <w:gridCol w:w="4702"/>
-      </w:tblGrid>
-      <w:tr>
-        <w:tc>
-          <w:tcPr>
-            <w:tcW w:type="dxa" w:w="3312"/>
-            <w:shd w:fill="F3F4F6"/>
-          </w:tcPr>
-          <w:p>
-            <w:pPr>
-              <w:jc w:val="left"/>
-            </w:pPr>
-            <w:r>
-              <w:rPr>
-                <w:rFonts w:ascii="Arial" w:hAnsi="Arial"/>
-                <w:b/>
-                <w:color w:val="1F2937"/>
-                <w:sz w:val="19"/>
-              </w:rPr>
-              <w:t>Empresa Piloto / Cliente:</w:t>
-            </w:r>
-          </w:p>
-        </w:tc>
-        <w:tc>
-          <w:tcPr>
-            <w:tcW w:type="dxa" w:w="6480"/>
-            <w:shd w:fill="F3F4F6"/>
-          </w:tcPr>
-          <w:p>
-            <w:pPr>
-              <w:jc w:val="both"/>
-            </w:pPr>
-            <w:r>
-              <w:rPr>
-                <w:rFonts w:ascii="Arial" w:hAnsi="Arial"/>
-                <w:color w:val="374151"/>
-                <w:sz w:val="19"/>
-              </w:rPr>
-              <w:t>Papelaria Real Ltda (Fundada em 15 de agosto de 1981)</w:t>
-            </w:r>
-          </w:p>
-        </w:tc>
-      </w:tr>
-      <w:tr>
-        <w:tc>
-          <w:tcPr>
-            <w:tcW w:type="dxa" w:w="3312"/>
-            <w:shd w:fill="FFFFFF"/>
-          </w:tcPr>
-          <w:p>
-            <w:pPr>
-              <w:jc w:val="left"/>
-            </w:pPr>
-            <w:r>
-              <w:rPr>
-                <w:rFonts w:ascii="Arial" w:hAnsi="Arial"/>
-                <w:b/>
-                <w:color w:val="1F2937"/>
-                <w:sz w:val="19"/>
-              </w:rPr>
-              <w:t>Público Entrevistado:</w:t>
-            </w:r>
-          </w:p>
-        </w:tc>
-        <w:tc>
-          <w:tcPr>
-            <w:tcW w:type="dxa" w:w="6480"/>
-            <w:shd w:fill="FFFFFF"/>
-          </w:tcPr>
-          <w:p>
-            <w:pPr>
-              <w:jc w:val="both"/>
-            </w:pPr>
-            <w:r>
-              <w:rPr>
-                <w:rFonts w:ascii="Arial" w:hAnsi="Arial"/>
-                <w:color w:val="374151"/>
-                <w:sz w:val="19"/>
-              </w:rPr>
-              <w:t>Sueli Maria Castanho Albuquerque Souza e Osnir (Proprietários Fundadores)</w:t>
-            </w:r>
-          </w:p>
-        </w:tc>
-      </w:tr>
-      <w:tr>
-        <w:tc>
-          <w:tcPr>
-            <w:tcW w:type="dxa" w:w="3312"/>
-            <w:shd w:fill="F3F4F6"/>
-          </w:tcPr>
-          <w:p>
-            <w:pPr>
-              <w:jc w:val="left"/>
-            </w:pPr>
-            <w:r>
-              <w:rPr>
-                <w:rFonts w:ascii="Arial" w:hAnsi="Arial"/>
-                <w:b/>
-                <w:color w:val="1F2937"/>
-                <w:sz w:val="19"/>
-              </w:rPr>
-              <w:t>Equipe Técnica (Mr. Coding):</w:t>
-            </w:r>
-          </w:p>
-        </w:tc>
-        <w:tc>
-          <w:tcPr>
-            <w:tcW w:type="dxa" w:w="6480"/>
-            <w:shd w:fill="F3F4F6"/>
-          </w:tcPr>
-          <w:p>
-            <w:pPr>
-              <w:jc w:val="both"/>
-            </w:pPr>
-            <w:r>
-              <w:rPr>
-                <w:rFonts w:ascii="Arial" w:hAnsi="Arial"/>
-                <w:color w:val="374151"/>
-                <w:sz w:val="19"/>
-              </w:rPr>
-              <w:t>Cesar Augusto da Silva Junior, Douglas Moraes Braz, Eduardo Sugahara Neto, Enzo de Oliveira Soares, Nikolas Pires Brandão</w:t>
-            </w:r>
-          </w:p>
-        </w:tc>
-      </w:tr>
-      <w:tr>
-        <w:tc>
-          <w:tcPr>
-            <w:tcW w:type="dxa" w:w="3312"/>
-            <w:shd w:fill="FFFFFF"/>
-          </w:tcPr>
-          <w:p>
-            <w:pPr>
-              <w:jc w:val="left"/>
-            </w:pPr>
-            <w:r>
-              <w:rPr>
-                <w:rFonts w:ascii="Arial" w:hAnsi="Arial"/>
-                <w:b/>
-                <w:color w:val="1F2937"/>
-                <w:sz w:val="19"/>
-              </w:rPr>
-              <w:t>Orientação Pedagógica:</w:t>
-            </w:r>
-          </w:p>
-        </w:tc>
-        <w:tc>
-          <w:tcPr>
-            <w:tcW w:type="dxa" w:w="6480"/>
-            <w:shd w:fill="FFFFFF"/>
-          </w:tcPr>
-          <w:p>
-            <w:pPr>
-              <w:jc w:val="both"/>
-            </w:pPr>
-            <w:r>
-              <w:rPr>
-                <w:rFonts w:ascii="Arial" w:hAnsi="Arial"/>
-                <w:color w:val="374151"/>
-                <w:sz w:val="19"/>
-              </w:rPr>
-              <w:t>Prof. Luiz Flávio e Prof. Vinicius</w:t>
-            </w:r>
-          </w:p>
-        </w:tc>
-      </w:tr>
-      <w:tr>
-        <w:tc>
-          <w:tcPr>
-            <w:tcW w:type="dxa" w:w="3312"/>
-            <w:shd w:fill="F3F4F6"/>
-          </w:tcPr>
-          <w:p>
-            <w:pPr>
-              <w:jc w:val="left"/>
-            </w:pPr>
-            <w:r>
-              <w:rPr>
-                <w:rFonts w:ascii="Arial" w:hAnsi="Arial"/>
-                <w:b/>
-                <w:color w:val="1F2937"/>
-                <w:sz w:val="19"/>
-              </w:rPr>
-              <w:t>Local &amp; Canal de Coleta:</w:t>
-            </w:r>
-          </w:p>
-        </w:tc>
-        <w:tc>
-          <w:tcPr>
-            <w:tcW w:type="dxa" w:w="6480"/>
-            <w:shd w:fill="F3F4F6"/>
-          </w:tcPr>
-          <w:p>
-            <w:pPr>
-              <w:jc w:val="both"/>
-            </w:pPr>
-            <w:r>
-              <w:rPr>
-                <w:rFonts w:ascii="Arial" w:hAnsi="Arial"/>
-                <w:color w:val="374151"/>
-                <w:sz w:val="19"/>
-              </w:rPr>
-              <w:t>Balcão de Atendimento Presencial da Papelaria Real • Sorocaba – SP</w:t>
-            </w:r>
-          </w:p>
-        </w:tc>
-      </w:tr>
-      <w:tr>
-        <w:tc>
-          <w:tcPr>
-            <w:tcW w:type="dxa" w:w="3312"/>
-            <w:shd w:fill="FFFFFF"/>
-          </w:tcPr>
-          <w:p>
-            <w:pPr>
-              <w:jc w:val="left"/>
-            </w:pPr>
-            <w:r>
-              <w:rPr>
-                <w:rFonts w:ascii="Arial" w:hAnsi="Arial"/>
-                <w:b/>
-                <w:color w:val="1F2937"/>
-                <w:sz w:val="19"/>
-              </w:rPr>
-              <w:t>Finalidade Acadêmica:</w:t>
-            </w:r>
-          </w:p>
-        </w:tc>
-        <w:tc>
-          <w:tcPr>
-            <w:tcW w:type="dxa" w:w="6480"/>
-            <w:shd w:fill="FFFFFF"/>
-          </w:tcPr>
-          <w:p>
-            <w:pPr>
-              <w:jc w:val="both"/>
-            </w:pPr>
-            <w:r>
-              <w:rPr>
-                <w:rFonts w:ascii="Arial" w:hAnsi="Arial"/>
-                <w:color w:val="374151"/>
-                <w:sz w:val="19"/>
-              </w:rPr>
-              <w:t>Levantamento empírico de requisitos de software (Engenharia de Requisitos) e validação operacional das regras de negócio para o MrStock ERP.</w:t>
-            </w:r>
-          </w:p>
-        </w:tc>
-      </w:tr>
-    </w:tbl>
     <w:p>
       <w:pPr>
-        <w:jc w:val="left"/>
-        <w:spacing w:before="100" w:after="100" w:line="276" w:lineRule="auto"/>
+        <w:jc w:val="both"/>
+        <w:spacing w:before="80" w:after="160" w:line="276" w:lineRule="auto"/>
       </w:pPr>
+      <w:r>
+        <w:rPr>
+          <w:rFonts w:ascii="Arial" w:hAnsi="Arial"/>
+          <w:color w:val="374151"/>
+          <w:sz w:val="20"/>
+        </w:rPr>
+        <w:t>Entrevista semiestruturada realizada presencialmente com os fundadores e proprietários da Papelaria Real Ltda, Sra. Sueli Maria Castanho Albuquerque Souza e Sr. Osnir, pela equipe técnica Mr. Coding (ETEC Fernando Prestes). O objetivo do instrumento foi levantar os requisitos funcionais, entender a rotina de vendas no balcão físico e diagnosticar as necessidades reais de controle de estoque para o desenvolvimento do MrStock ERP.</w:t>
+      </w:r>
     </w:p>
     <w:p>
       <w:pPr>
         <w:jc w:val="left"/>
-        <w:spacing w:before="240" w:after="100" w:line="276" w:lineRule="auto"/>
+        <w:spacing w:before="240" w:after="80" w:line="276" w:lineRule="auto"/>
       </w:pPr>
       <w:r>
         <w:rPr>
@@ -345,36 +219,7 @@
           <w:color w:val="000000"/>
           <w:sz w:val="24"/>
         </w:rPr>
-        <w:t>1. APRESENTAÇÃO E OBJETIVO DA ENTREVISTA</w:t>
-      </w:r>
-    </w:p>
-    <w:p>
-      <w:pPr>
-        <w:jc w:val="both"/>
-        <w:spacing w:before="60" w:after="120" w:line="276" w:lineRule="auto"/>
-      </w:pPr>
-      <w:r>
-        <w:rPr>
-          <w:rFonts w:ascii="Arial" w:hAnsi="Arial"/>
-          <w:color w:val="111827"/>
-          <w:sz w:val="22"/>
-        </w:rPr>
-        <w:t>No âmbito do Trabalho de Conclusão de Curso (TCC) do Curso Técnico em Desenvolvimento de Sistemas da ETEC Fernando Prestes, a equipe Mr. Coding conduziu um processo de Engenharia de Requisitos baseado em entrevistas semiestruturadas com a gerência da Papelaria Real Ltda. O objetivo central deste instrumento foi diagnosticar os gargalos cotidianos enfrentados pelo comércio de papelaria no balcão e no almoxarifado, compreender a rotina física de entrada e saída de produtos, e mapear os requisitos funcionais e não funcionais que nortearam o desenvolvimento do MrStock ERP (versão 2.2.0).</w:t>
-      </w:r>
-    </w:p>
-    <w:p>
-      <w:pPr>
-        <w:jc w:val="left"/>
-        <w:spacing w:before="240" w:after="100" w:line="276" w:lineRule="auto"/>
-      </w:pPr>
-      <w:r>
-        <w:rPr>
-          <w:rFonts w:ascii="Arial" w:hAnsi="Arial"/>
-          <w:b/>
-          <w:color w:val="000000"/>
-          <w:sz w:val="24"/>
-        </w:rPr>
-        <w:t>2. BLOCO 1: HISTÓRICO, ROTINA E PERFIL DA EMPRESA</w:t>
+        <w:t>1. CONHECENDO O CLIENTE</w:t>
       </w:r>
     </w:p>
     <w:p>
@@ -387,7 +232,7 @@
           <w:rFonts w:ascii="Arial" w:hAnsi="Arial"/>
           <w:b/>
           <w:color w:val="111827"/>
-          <w:sz w:val="22"/>
+          <w:sz w:val="21"/>
         </w:rPr>
         <w:t xml:space="preserve">Pergunta 01: </w:t>
       </w:r>
@@ -396,7 +241,7 @@
           <w:rFonts w:ascii="Arial" w:hAnsi="Arial"/>
           <w:b/>
           <w:color w:val="111827"/>
-          <w:sz w:val="22"/>
+          <w:sz w:val="21"/>
         </w:rPr>
         <w:t>"Qual a rotina da empresa?"</w:t>
       </w:r>
@@ -404,8 +249,8 @@
     <w:p>
       <w:pPr>
         <w:jc w:val="both"/>
-        <w:spacing w:before="40" w:after="140" w:line="276" w:lineRule="auto"/>
-        <w:ind w:left="400"/>
+        <w:spacing w:before="20" w:after="120" w:line="276" w:lineRule="auto"/>
+        <w:ind w:left="360"/>
       </w:pPr>
       <w:r>
         <w:rPr>
@@ -413,7 +258,7 @@
           <w:b/>
           <w:i/>
           <w:color w:val="374151"/>
-          <w:sz w:val="21"/>
+          <w:sz w:val="20"/>
         </w:rPr>
         <w:t xml:space="preserve">Resposta: </w:t>
       </w:r>
@@ -422,9 +267,9 @@
           <w:rFonts w:ascii="Arial" w:hAnsi="Arial"/>
           <w:i/>
           <w:color w:val="374151"/>
-          <w:sz w:val="21"/>
+          <w:sz w:val="20"/>
         </w:rPr>
-        <w:t>A rotina da empresa é baseada em processos simples e majoritariamente manuais, com a maior parte das informações registrada por meio de anotações no papel. As vendas ocorrem diariamente no balcão físico, atendendo tanto o público escolar quanto clientes corporativos e escolas da região.</w:t>
+        <w:t>A rotina é baseada em processos simples, focada no atendimento diário de balcão físico, com a maior parte das movimentações e vendas anotada manualmente no papel.</w:t>
       </w:r>
     </w:p>
     <w:p>
@@ -437,7 +282,7 @@
           <w:rFonts w:ascii="Arial" w:hAnsi="Arial"/>
           <w:b/>
           <w:color w:val="111827"/>
-          <w:sz w:val="22"/>
+          <w:sz w:val="21"/>
         </w:rPr>
         <w:t xml:space="preserve">Pergunta 02: </w:t>
       </w:r>
@@ -446,7 +291,7 @@
           <w:rFonts w:ascii="Arial" w:hAnsi="Arial"/>
           <w:b/>
           <w:color w:val="111827"/>
-          <w:sz w:val="22"/>
+          <w:sz w:val="21"/>
         </w:rPr>
         <w:t>"Qual o público-alvo da empresa?"</w:t>
       </w:r>
@@ -454,8 +299,8 @@
     <w:p>
       <w:pPr>
         <w:jc w:val="both"/>
-        <w:spacing w:before="40" w:after="140" w:line="276" w:lineRule="auto"/>
-        <w:ind w:left="400"/>
+        <w:spacing w:before="20" w:after="120" w:line="276" w:lineRule="auto"/>
+        <w:ind w:left="360"/>
       </w:pPr>
       <w:r>
         <w:rPr>
@@ -463,7 +308,7 @@
           <w:b/>
           <w:i/>
           <w:color w:val="374151"/>
-          <w:sz w:val="21"/>
+          <w:sz w:val="20"/>
         </w:rPr>
         <w:t xml:space="preserve">Resposta: </w:t>
       </w:r>
@@ -472,9 +317,9 @@
           <w:rFonts w:ascii="Arial" w:hAnsi="Arial"/>
           <w:i/>
           <w:color w:val="374151"/>
-          <w:sz w:val="21"/>
+          <w:sz w:val="20"/>
         </w:rPr>
-        <w:t>Pessoas na fase escolar (escolas e faculdades), além de professores, universitários e empresas parceiras do bairro.</w:t>
+        <w:t>Pessoas em fase escolar (estudantes de escolas e faculdades), professores, universitários e empresas ou escritórios da região.</w:t>
       </w:r>
     </w:p>
     <w:p>
@@ -487,7 +332,7 @@
           <w:rFonts w:ascii="Arial" w:hAnsi="Arial"/>
           <w:b/>
           <w:color w:val="111827"/>
-          <w:sz w:val="22"/>
+          <w:sz w:val="21"/>
         </w:rPr>
         <w:t xml:space="preserve">Pergunta 03: </w:t>
       </w:r>
@@ -496,7 +341,7 @@
           <w:rFonts w:ascii="Arial" w:hAnsi="Arial"/>
           <w:b/>
           <w:color w:val="111827"/>
-          <w:sz w:val="22"/>
+          <w:sz w:val="21"/>
         </w:rPr>
         <w:t>"Quando a empresa foi fundada?"</w:t>
       </w:r>
@@ -504,8 +349,8 @@
     <w:p>
       <w:pPr>
         <w:jc w:val="both"/>
-        <w:spacing w:before="40" w:after="140" w:line="276" w:lineRule="auto"/>
-        <w:ind w:left="400"/>
+        <w:spacing w:before="20" w:after="120" w:line="276" w:lineRule="auto"/>
+        <w:ind w:left="360"/>
       </w:pPr>
       <w:r>
         <w:rPr>
@@ -513,7 +358,7 @@
           <w:b/>
           <w:i/>
           <w:color w:val="374151"/>
-          <w:sz w:val="21"/>
+          <w:sz w:val="20"/>
         </w:rPr>
         <w:t xml:space="preserve">Resposta: </w:t>
       </w:r>
@@ -522,7 +367,7 @@
           <w:rFonts w:ascii="Arial" w:hAnsi="Arial"/>
           <w:i/>
           <w:color w:val="374151"/>
-          <w:sz w:val="21"/>
+          <w:sz w:val="20"/>
         </w:rPr>
         <w:t>Em 15 de agosto de 1981.</w:t>
       </w:r>
@@ -537,7 +382,7 @@
           <w:rFonts w:ascii="Arial" w:hAnsi="Arial"/>
           <w:b/>
           <w:color w:val="111827"/>
-          <w:sz w:val="22"/>
+          <w:sz w:val="21"/>
         </w:rPr>
         <w:t xml:space="preserve">Pergunta 04: </w:t>
       </w:r>
@@ -546,7 +391,7 @@
           <w:rFonts w:ascii="Arial" w:hAnsi="Arial"/>
           <w:b/>
           <w:color w:val="111827"/>
-          <w:sz w:val="22"/>
+          <w:sz w:val="21"/>
         </w:rPr>
         <w:t>"Quem criou a empresa?"</w:t>
       </w:r>
@@ -554,8 +399,8 @@
     <w:p>
       <w:pPr>
         <w:jc w:val="both"/>
-        <w:spacing w:before="40" w:after="140" w:line="276" w:lineRule="auto"/>
-        <w:ind w:left="400"/>
+        <w:spacing w:before="20" w:after="120" w:line="276" w:lineRule="auto"/>
+        <w:ind w:left="360"/>
       </w:pPr>
       <w:r>
         <w:rPr>
@@ -563,7 +408,7 @@
           <w:b/>
           <w:i/>
           <w:color w:val="374151"/>
-          <w:sz w:val="21"/>
+          <w:sz w:val="20"/>
         </w:rPr>
         <w:t xml:space="preserve">Resposta: </w:t>
       </w:r>
@@ -572,7 +417,7 @@
           <w:rFonts w:ascii="Arial" w:hAnsi="Arial"/>
           <w:i/>
           <w:color w:val="374151"/>
-          <w:sz w:val="21"/>
+          <w:sz w:val="20"/>
         </w:rPr>
         <w:t>Sueli Maria Castanho Albuquerque Souza e seu marido Osnir.</w:t>
       </w:r>
@@ -587,7 +432,7 @@
           <w:rFonts w:ascii="Arial" w:hAnsi="Arial"/>
           <w:b/>
           <w:color w:val="111827"/>
-          <w:sz w:val="22"/>
+          <w:sz w:val="21"/>
         </w:rPr>
         <w:t xml:space="preserve">Pergunta 05: </w:t>
       </w:r>
@@ -596,7 +441,7 @@
           <w:rFonts w:ascii="Arial" w:hAnsi="Arial"/>
           <w:b/>
           <w:color w:val="111827"/>
-          <w:sz w:val="22"/>
+          <w:sz w:val="21"/>
         </w:rPr>
         <w:t>"Como começou a empresa (pequena, familiar, etc.)?"</w:t>
       </w:r>
@@ -604,8 +449,8 @@
     <w:p>
       <w:pPr>
         <w:jc w:val="both"/>
-        <w:spacing w:before="40" w:after="140" w:line="276" w:lineRule="auto"/>
-        <w:ind w:left="400"/>
+        <w:spacing w:before="20" w:after="120" w:line="276" w:lineRule="auto"/>
+        <w:ind w:left="360"/>
       </w:pPr>
       <w:r>
         <w:rPr>
@@ -613,7 +458,7 @@
           <w:b/>
           <w:i/>
           <w:color w:val="374151"/>
-          <w:sz w:val="21"/>
+          <w:sz w:val="20"/>
         </w:rPr>
         <w:t xml:space="preserve">Resposta: </w:t>
       </w:r>
@@ -622,9 +467,9 @@
           <w:rFonts w:ascii="Arial" w:hAnsi="Arial"/>
           <w:i/>
           <w:color w:val="374151"/>
-          <w:sz w:val="21"/>
+          <w:sz w:val="20"/>
         </w:rPr>
-        <w:t>Começou como um negócio estritamente familiar, contando com apenas 3 funcionários no início (a proprietária, seu marido e a irmã da proprietária).</w:t>
+        <w:t>Começou como uma empresa estritamente familiar, contando com apenas 3 funcionários no início (a proprietária Sueli, o marido Osnir e a irmã da proprietária).</w:t>
       </w:r>
     </w:p>
     <w:p>
@@ -637,7 +482,7 @@
           <w:rFonts w:ascii="Arial" w:hAnsi="Arial"/>
           <w:b/>
           <w:color w:val="111827"/>
-          <w:sz w:val="22"/>
+          <w:sz w:val="21"/>
         </w:rPr>
         <w:t xml:space="preserve">Pergunta 06: </w:t>
       </w:r>
@@ -646,7 +491,7 @@
           <w:rFonts w:ascii="Arial" w:hAnsi="Arial"/>
           <w:b/>
           <w:color w:val="111827"/>
-          <w:sz w:val="22"/>
+          <w:sz w:val="21"/>
         </w:rPr>
         <w:t>"Quantos funcionários trabalham aqui atualmente?"</w:t>
       </w:r>
@@ -654,8 +499,8 @@
     <w:p>
       <w:pPr>
         <w:jc w:val="both"/>
-        <w:spacing w:before="40" w:after="140" w:line="276" w:lineRule="auto"/>
-        <w:ind w:left="400"/>
+        <w:spacing w:before="20" w:after="120" w:line="276" w:lineRule="auto"/>
+        <w:ind w:left="360"/>
       </w:pPr>
       <w:r>
         <w:rPr>
@@ -663,7 +508,7 @@
           <w:b/>
           <w:i/>
           <w:color w:val="374151"/>
-          <w:sz w:val="21"/>
+          <w:sz w:val="20"/>
         </w:rPr>
         <w:t xml:space="preserve">Resposta: </w:t>
       </w:r>
@@ -672,7 +517,7 @@
           <w:rFonts w:ascii="Arial" w:hAnsi="Arial"/>
           <w:i/>
           <w:color w:val="374151"/>
-          <w:sz w:val="21"/>
+          <w:sz w:val="20"/>
         </w:rPr>
         <w:t>Atualmente trabalham 5 pessoas no total: 3 funcionários contratados, além da dona e de seu marido.</w:t>
       </w:r>
@@ -680,7 +525,7 @@
     <w:p>
       <w:pPr>
         <w:jc w:val="left"/>
-        <w:spacing w:before="240" w:after="100" w:line="276" w:lineRule="auto"/>
+        <w:spacing w:before="240" w:after="80" w:line="276" w:lineRule="auto"/>
       </w:pPr>
       <w:r>
         <w:rPr>
@@ -689,7 +534,7 @@
           <w:color w:val="000000"/>
           <w:sz w:val="24"/>
         </w:rPr>
-        <w:t>3. BLOCO 2: DIAGNÓSTICO DE NECESSIDADES E CONTROLE DE ESTOQUE</w:t>
+        <w:t>2. NECESSIDADES DO CLIENTE</w:t>
       </w:r>
     </w:p>
     <w:p>
@@ -702,7 +547,7 @@
           <w:rFonts w:ascii="Arial" w:hAnsi="Arial"/>
           <w:b/>
           <w:color w:val="111827"/>
-          <w:sz w:val="22"/>
+          <w:sz w:val="21"/>
         </w:rPr>
         <w:t xml:space="preserve">Pergunta 07: </w:t>
       </w:r>
@@ -711,7 +556,7 @@
           <w:rFonts w:ascii="Arial" w:hAnsi="Arial"/>
           <w:b/>
           <w:color w:val="111827"/>
-          <w:sz w:val="22"/>
+          <w:sz w:val="21"/>
         </w:rPr>
         <w:t>"Qual seria a principal coisa que você gostaria que o sistema resolvesse?"</w:t>
       </w:r>
@@ -719,8 +564,8 @@
     <w:p>
       <w:pPr>
         <w:jc w:val="both"/>
-        <w:spacing w:before="40" w:after="140" w:line="276" w:lineRule="auto"/>
-        <w:ind w:left="400"/>
+        <w:spacing w:before="20" w:after="120" w:line="276" w:lineRule="auto"/>
+        <w:ind w:left="360"/>
       </w:pPr>
       <w:r>
         <w:rPr>
@@ -728,7 +573,7 @@
           <w:b/>
           <w:i/>
           <w:color w:val="374151"/>
-          <w:sz w:val="21"/>
+          <w:sz w:val="20"/>
         </w:rPr>
         <w:t xml:space="preserve">Resposta: </w:t>
       </w:r>
@@ -737,9 +582,9 @@
           <w:rFonts w:ascii="Arial" w:hAnsi="Arial"/>
           <w:i/>
           <w:color w:val="374151"/>
-          <w:sz w:val="21"/>
+          <w:sz w:val="20"/>
         </w:rPr>
-        <w:t>Organização de estoque, cadastro ágil de itens e controle eficiente das mercadorias de balcão.</w:t>
+        <w:t>Organização eficiente do estoque, agilidade no cadastro de itens e controle preciso das mercadorias comercializadas no balcão.</w:t>
       </w:r>
     </w:p>
     <w:p>
@@ -752,7 +597,7 @@
           <w:rFonts w:ascii="Arial" w:hAnsi="Arial"/>
           <w:b/>
           <w:color w:val="111827"/>
-          <w:sz w:val="22"/>
+          <w:sz w:val="21"/>
         </w:rPr>
         <w:t xml:space="preserve">Pergunta 08: </w:t>
       </w:r>
@@ -761,7 +606,7 @@
           <w:rFonts w:ascii="Arial" w:hAnsi="Arial"/>
           <w:b/>
           <w:color w:val="111827"/>
-          <w:sz w:val="22"/>
+          <w:sz w:val="21"/>
         </w:rPr>
         <w:t>"Existem processos que demandam muito esforço manual?"</w:t>
       </w:r>
@@ -769,8 +614,8 @@
     <w:p>
       <w:pPr>
         <w:jc w:val="both"/>
-        <w:spacing w:before="40" w:after="140" w:line="276" w:lineRule="auto"/>
-        <w:ind w:left="400"/>
+        <w:spacing w:before="20" w:after="120" w:line="276" w:lineRule="auto"/>
+        <w:ind w:left="360"/>
       </w:pPr>
       <w:r>
         <w:rPr>
@@ -778,7 +623,7 @@
           <w:b/>
           <w:i/>
           <w:color w:val="374151"/>
-          <w:sz w:val="21"/>
+          <w:sz w:val="20"/>
         </w:rPr>
         <w:t xml:space="preserve">Resposta: </w:t>
       </w:r>
@@ -787,9 +632,9 @@
           <w:rFonts w:ascii="Arial" w:hAnsi="Arial"/>
           <w:i/>
           <w:color w:val="374151"/>
-          <w:sz w:val="21"/>
+          <w:sz w:val="20"/>
         </w:rPr>
-        <w:t>Não consideramos excessivo no esforço braçal diário, mas as anotações e buscas manuais em cadernos tomam tempo.</w:t>
+        <w:t>Não consideramos excessivo no esforço braçal diário, mas a busca e anotação manual em papéis e cadernos consome muito tempo da equipe.</w:t>
       </w:r>
     </w:p>
     <w:p>
@@ -802,7 +647,7 @@
           <w:rFonts w:ascii="Arial" w:hAnsi="Arial"/>
           <w:b/>
           <w:color w:val="111827"/>
-          <w:sz w:val="22"/>
+          <w:sz w:val="21"/>
         </w:rPr>
         <w:t xml:space="preserve">Pergunta 09: </w:t>
       </w:r>
@@ -811,7 +656,7 @@
           <w:rFonts w:ascii="Arial" w:hAnsi="Arial"/>
           <w:b/>
           <w:color w:val="111827"/>
-          <w:sz w:val="22"/>
+          <w:sz w:val="21"/>
         </w:rPr>
         <w:t>"Já houve problemas com perda ou falta de controle de produtos?"</w:t>
       </w:r>
@@ -819,8 +664,8 @@
     <w:p>
       <w:pPr>
         <w:jc w:val="both"/>
-        <w:spacing w:before="40" w:after="140" w:line="276" w:lineRule="auto"/>
-        <w:ind w:left="400"/>
+        <w:spacing w:before="20" w:after="120" w:line="276" w:lineRule="auto"/>
+        <w:ind w:left="360"/>
       </w:pPr>
       <w:r>
         <w:rPr>
@@ -828,7 +673,7 @@
           <w:b/>
           <w:i/>
           <w:color w:val="374151"/>
-          <w:sz w:val="21"/>
+          <w:sz w:val="20"/>
         </w:rPr>
         <w:t xml:space="preserve">Resposta: </w:t>
       </w:r>
@@ -837,9 +682,9 @@
           <w:rFonts w:ascii="Arial" w:hAnsi="Arial"/>
           <w:i/>
           <w:color w:val="374151"/>
-          <w:sz w:val="21"/>
+          <w:sz w:val="20"/>
         </w:rPr>
-        <w:t>Sim, principalmente com o vencimento de produtos químicos e pedagógicos que acabam sendo comprados em grande quantidade e ultrapassam a data de validade sem que a loja perceba a tempo.</w:t>
+        <w:t>Sim, principalmente com o vencimento de produtos químicos e pedagógicos que acabam sendo comprados em grande quantidade e ultrapassam o prazo de validade sem que a loja perceba a tempo.</w:t>
       </w:r>
     </w:p>
     <w:p>
@@ -852,7 +697,7 @@
           <w:rFonts w:ascii="Arial" w:hAnsi="Arial"/>
           <w:b/>
           <w:color w:val="111827"/>
-          <w:sz w:val="22"/>
+          <w:sz w:val="21"/>
         </w:rPr>
         <w:t xml:space="preserve">Pergunta 10: </w:t>
       </w:r>
@@ -861,16 +706,16 @@
           <w:rFonts w:ascii="Arial" w:hAnsi="Arial"/>
           <w:b/>
           <w:color w:val="111827"/>
-          <w:sz w:val="22"/>
+          <w:sz w:val="21"/>
         </w:rPr>
-        <w:t>"Quais produtos do catálogo da Papelaria Real são mais críticos quanto à perda por data de validade vencida?"</w:t>
+        <w:t>"Você prefere usar o sistema no computador ou celular?"</w:t>
       </w:r>
     </w:p>
     <w:p>
       <w:pPr>
         <w:jc w:val="both"/>
-        <w:spacing w:before="40" w:after="140" w:line="276" w:lineRule="auto"/>
-        <w:ind w:left="400"/>
+        <w:spacing w:before="20" w:after="120" w:line="276" w:lineRule="auto"/>
+        <w:ind w:left="360"/>
       </w:pPr>
       <w:r>
         <w:rPr>
@@ -878,7 +723,7 @@
           <w:b/>
           <w:i/>
           <w:color w:val="374151"/>
-          <w:sz w:val="21"/>
+          <w:sz w:val="20"/>
         </w:rPr>
         <w:t xml:space="preserve">Resposta: </w:t>
       </w:r>
@@ -887,7 +732,207 @@
           <w:rFonts w:ascii="Arial" w:hAnsi="Arial"/>
           <w:i/>
           <w:color w:val="374151"/>
+          <w:sz w:val="20"/>
+        </w:rPr>
+        <w:t>Computador instalado diretamente no balcão de atendimento da loja.</w:t>
+      </w:r>
+    </w:p>
+    <w:p>
+      <w:pPr>
+        <w:jc w:val="both"/>
+        <w:spacing w:before="120" w:after="40" w:line="276" w:lineRule="auto"/>
+      </w:pPr>
+      <w:r>
+        <w:rPr>
+          <w:rFonts w:ascii="Arial" w:hAnsi="Arial"/>
+          <w:b/>
+          <w:color w:val="111827"/>
           <w:sz w:val="21"/>
+        </w:rPr>
+        <w:t xml:space="preserve">Pergunta 11: </w:t>
+      </w:r>
+      <w:r>
+        <w:rPr>
+          <w:rFonts w:ascii="Arial" w:hAnsi="Arial"/>
+          <w:b/>
+          <w:color w:val="111827"/>
+          <w:sz w:val="21"/>
+        </w:rPr>
+        <w:t>"Cada funcionário deveria ter um login próprio?"</w:t>
+      </w:r>
+    </w:p>
+    <w:p>
+      <w:pPr>
+        <w:jc w:val="both"/>
+        <w:spacing w:before="20" w:after="120" w:line="276" w:lineRule="auto"/>
+        <w:ind w:left="360"/>
+      </w:pPr>
+      <w:r>
+        <w:rPr>
+          <w:rFonts w:ascii="Arial" w:hAnsi="Arial"/>
+          <w:b/>
+          <w:i/>
+          <w:color w:val="374151"/>
+          <w:sz w:val="20"/>
+        </w:rPr>
+        <w:t xml:space="preserve">Resposta: </w:t>
+      </w:r>
+      <w:r>
+        <w:rPr>
+          <w:rFonts w:ascii="Arial" w:hAnsi="Arial"/>
+          <w:i/>
+          <w:color w:val="374151"/>
+          <w:sz w:val="20"/>
+        </w:rPr>
+        <w:t>Não é necessário um login individual para cada funcionário na rotina de vendas; perfis gerais bem definidos (como Caixa para operação e Administrador para gestão) já atendem perfeitamente.</w:t>
+      </w:r>
+    </w:p>
+    <w:p>
+      <w:pPr>
+        <w:jc w:val="both"/>
+        <w:spacing w:before="120" w:after="40" w:line="276" w:lineRule="auto"/>
+      </w:pPr>
+      <w:r>
+        <w:rPr>
+          <w:rFonts w:ascii="Arial" w:hAnsi="Arial"/>
+          <w:b/>
+          <w:color w:val="111827"/>
+          <w:sz w:val="21"/>
+        </w:rPr>
+        <w:t xml:space="preserve">Pergunta 12: </w:t>
+      </w:r>
+      <w:r>
+        <w:rPr>
+          <w:rFonts w:ascii="Arial" w:hAnsi="Arial"/>
+          <w:b/>
+          <w:color w:val="111827"/>
+          <w:sz w:val="21"/>
+        </w:rPr>
+        <w:t>"Você gostaria de exportar relatórios (PDF ou Excel)?"</w:t>
+      </w:r>
+    </w:p>
+    <w:p>
+      <w:pPr>
+        <w:jc w:val="both"/>
+        <w:spacing w:before="20" w:after="120" w:line="276" w:lineRule="auto"/>
+        <w:ind w:left="360"/>
+      </w:pPr>
+      <w:r>
+        <w:rPr>
+          <w:rFonts w:ascii="Arial" w:hAnsi="Arial"/>
+          <w:b/>
+          <w:i/>
+          <w:color w:val="374151"/>
+          <w:sz w:val="20"/>
+        </w:rPr>
+        <w:t xml:space="preserve">Resposta: </w:t>
+      </w:r>
+      <w:r>
+        <w:rPr>
+          <w:rFonts w:ascii="Arial" w:hAnsi="Arial"/>
+          <w:i/>
+          <w:color w:val="374151"/>
+          <w:sz w:val="20"/>
+        </w:rPr>
+        <w:t>É opcional. Seria interessante ter para conferências pontuais, mas a prioridade e foco principal é a consulta direta e rápida na tela.</w:t>
+      </w:r>
+    </w:p>
+    <w:p>
+      <w:pPr>
+        <w:jc w:val="both"/>
+        <w:spacing w:before="120" w:after="40" w:line="276" w:lineRule="auto"/>
+      </w:pPr>
+      <w:r>
+        <w:rPr>
+          <w:rFonts w:ascii="Arial" w:hAnsi="Arial"/>
+          <w:b/>
+          <w:color w:val="111827"/>
+          <w:sz w:val="21"/>
+        </w:rPr>
+        <w:t xml:space="preserve">Pergunta 13: </w:t>
+      </w:r>
+      <w:r>
+        <w:rPr>
+          <w:rFonts w:ascii="Arial" w:hAnsi="Arial"/>
+          <w:b/>
+          <w:color w:val="111827"/>
+          <w:sz w:val="21"/>
+        </w:rPr>
+        <w:t>"Seria útil cadastrar fornecedores no sistema?"</w:t>
+      </w:r>
+    </w:p>
+    <w:p>
+      <w:pPr>
+        <w:jc w:val="both"/>
+        <w:spacing w:before="20" w:after="120" w:line="276" w:lineRule="auto"/>
+        <w:ind w:left="360"/>
+      </w:pPr>
+      <w:r>
+        <w:rPr>
+          <w:rFonts w:ascii="Arial" w:hAnsi="Arial"/>
+          <w:b/>
+          <w:i/>
+          <w:color w:val="374151"/>
+          <w:sz w:val="20"/>
+        </w:rPr>
+        <w:t xml:space="preserve">Resposta: </w:t>
+      </w:r>
+      <w:r>
+        <w:rPr>
+          <w:rFonts w:ascii="Arial" w:hAnsi="Arial"/>
+          <w:i/>
+          <w:color w:val="374151"/>
+          <w:sz w:val="20"/>
+        </w:rPr>
+        <w:t>Sim, facilitaria saber com clareza de qual distribuidor ou fabricante compramos cada mercadoria para reposição.</w:t>
+      </w:r>
+    </w:p>
+    <w:p>
+      <w:pPr>
+        <w:jc w:val="both"/>
+        <w:spacing w:before="120" w:after="40" w:line="276" w:lineRule="auto"/>
+      </w:pPr>
+      <w:r>
+        <w:rPr>
+          <w:rFonts w:ascii="Arial" w:hAnsi="Arial"/>
+          <w:b/>
+          <w:color w:val="111827"/>
+          <w:sz w:val="21"/>
+        </w:rPr>
+        <w:t xml:space="preserve">Pergunta 14: </w:t>
+      </w:r>
+      <w:r>
+        <w:rPr>
+          <w:rFonts w:ascii="Arial" w:hAnsi="Arial"/>
+          <w:b/>
+          <w:color w:val="111827"/>
+          <w:sz w:val="21"/>
+        </w:rPr>
+        <w:t>"Quais produtos do catálogo da Papelaria Real são mais críticos quanto à perda por data de validade vencida?"</w:t>
+      </w:r>
+    </w:p>
+    <w:p>
+      <w:pPr>
+        <w:jc w:val="both"/>
+        <w:spacing w:before="20" w:after="120" w:line="276" w:lineRule="auto"/>
+        <w:ind w:left="360"/>
+      </w:pPr>
+      <w:r>
+        <w:rPr>
+          <w:rFonts w:ascii="Arial" w:hAnsi="Arial"/>
+          <w:b/>
+          <w:i/>
+          <w:color w:val="374151"/>
+          <w:sz w:val="20"/>
+        </w:rPr>
+        <w:t xml:space="preserve">Resposta: </w:t>
+      </w:r>
+      <w:r>
+        <w:rPr>
+          <w:rFonts w:ascii="Arial" w:hAnsi="Arial"/>
+          <w:i/>
+          <w:color w:val="374151"/>
+          <w:sz w:val="20"/>
         </w:rPr>
         <w:t>Tintas guache, colas líquidas e bastão, massinhas de modelar, corretivos líquidos e fitas adesivas. Precisamos ser avisados visualmente no painel quando um lote estiver a 30 dias de vencer para colocar em promoção ou devolver ao fabricante.</w:t>
       </w:r>
@@ -902,16 +947,16 @@
           <w:rFonts w:ascii="Arial" w:hAnsi="Arial"/>
           <w:b/>
           <w:color w:val="111827"/>
-          <w:sz w:val="22"/>
+          <w:sz w:val="21"/>
         </w:rPr>
-        <w:t xml:space="preserve">Pergunta 11: </w:t>
+        <w:t xml:space="preserve">Pergunta 15: </w:t>
       </w:r>
       <w:r>
         <w:rPr>
           <w:rFonts w:ascii="Arial" w:hAnsi="Arial"/>
           <w:b/>
           <w:color w:val="111827"/>
-          <w:sz w:val="22"/>
+          <w:sz w:val="21"/>
         </w:rPr>
         <w:t>"Vocês seguem o critério de que o lote que chegou primeiro à loja deve ser o primeiro a ser colocado na prateleira para venda?"</w:t>
       </w:r>
@@ -919,8 +964,8 @@
     <w:p>
       <w:pPr>
         <w:jc w:val="both"/>
-        <w:spacing w:before="40" w:after="140" w:line="276" w:lineRule="auto"/>
-        <w:ind w:left="400"/>
+        <w:spacing w:before="20" w:after="120" w:line="276" w:lineRule="auto"/>
+        <w:ind w:left="360"/>
       </w:pPr>
       <w:r>
         <w:rPr>
@@ -928,7 +973,7 @@
           <w:b/>
           <w:i/>
           <w:color w:val="374151"/>
-          <w:sz w:val="21"/>
+          <w:sz w:val="20"/>
         </w:rPr>
         <w:t xml:space="preserve">Resposta: </w:t>
       </w:r>
@@ -937,9 +982,9 @@
           <w:rFonts w:ascii="Arial" w:hAnsi="Arial"/>
           <w:i/>
           <w:color w:val="374151"/>
-          <w:sz w:val="21"/>
+          <w:sz w:val="20"/>
         </w:rPr>
-        <w:t>Sim.</w:t>
+        <w:t>Sim, seguimos a regra de que o produto que entrou primeiro no estoque deve ser o primeiro a sair para a venda (critério PEPS/FIFO).</w:t>
       </w:r>
     </w:p>
     <w:p>
@@ -952,16 +997,16 @@
           <w:rFonts w:ascii="Arial" w:hAnsi="Arial"/>
           <w:b/>
           <w:color w:val="111827"/>
-          <w:sz w:val="22"/>
+          <w:sz w:val="21"/>
         </w:rPr>
-        <w:t xml:space="preserve">Pergunta 12: </w:t>
+        <w:t xml:space="preserve">Pergunta 16: </w:t>
       </w:r>
       <w:r>
         <w:rPr>
           <w:rFonts w:ascii="Arial" w:hAnsi="Arial"/>
           <w:b/>
           <w:color w:val="111827"/>
-          <w:sz w:val="22"/>
+          <w:sz w:val="21"/>
         </w:rPr>
         <w:t>"Como os produtos são organizados fisicamente nos corredores e prateleiras da loja?"</w:t>
       </w:r>
@@ -969,8 +1014,8 @@
     <w:p>
       <w:pPr>
         <w:jc w:val="both"/>
-        <w:spacing w:before="40" w:after="140" w:line="276" w:lineRule="auto"/>
-        <w:ind w:left="400"/>
+        <w:spacing w:before="20" w:after="120" w:line="276" w:lineRule="auto"/>
+        <w:ind w:left="360"/>
       </w:pPr>
       <w:r>
         <w:rPr>
@@ -978,7 +1023,7 @@
           <w:b/>
           <w:i/>
           <w:color w:val="374151"/>
-          <w:sz w:val="21"/>
+          <w:sz w:val="20"/>
         </w:rPr>
         <w:t xml:space="preserve">Resposta: </w:t>
       </w:r>
@@ -987,9 +1032,24 @@
           <w:rFonts w:ascii="Arial" w:hAnsi="Arial"/>
           <w:i/>
           <w:color w:val="374151"/>
-          <w:sz w:val="21"/>
+          <w:sz w:val="20"/>
         </w:rPr>
         <w:t>Dividimos a loja por categorias de uso: cadernos em um lado, papéis e resmas em outro, instrumentos de escrita (canetas e lápis) no balcão, itens de corte e medição juntos, e colas/tintas no setor de artes. O catálogo do sistema precisa refletir essa mesma organização funcional.</w:t>
+      </w:r>
+    </w:p>
+    <w:p>
+      <w:pPr>
+        <w:jc w:val="left"/>
+        <w:spacing w:before="240" w:after="80" w:line="276" w:lineRule="auto"/>
+      </w:pPr>
+      <w:r>
+        <w:rPr>
+          <w:rFonts w:ascii="Arial" w:hAnsi="Arial"/>
+          <w:b/>
+          <w:color w:val="000000"/>
+          <w:sz w:val="24"/>
+        </w:rPr>
+        <w:t>3. COMO O CLIENTE TRABALHA</w:t>
       </w:r>
     </w:p>
     <w:p>
@@ -1002,25 +1062,25 @@
           <w:rFonts w:ascii="Arial" w:hAnsi="Arial"/>
           <w:b/>
           <w:color w:val="111827"/>
-          <w:sz w:val="22"/>
+          <w:sz w:val="21"/>
         </w:rPr>
-        <w:t xml:space="preserve">Pergunta 13: </w:t>
+        <w:t xml:space="preserve">Pergunta 17: </w:t>
       </w:r>
       <w:r>
         <w:rPr>
           <w:rFonts w:ascii="Arial" w:hAnsi="Arial"/>
           <w:b/>
           <w:color w:val="111827"/>
-          <w:sz w:val="22"/>
+          <w:sz w:val="21"/>
         </w:rPr>
-        <w:t>"Você prefere usar o sistema no computador ou celular?"</w:t>
+        <w:t>"Quais são as principais estratégias de marketing da empresa?"</w:t>
       </w:r>
     </w:p>
     <w:p>
       <w:pPr>
         <w:jc w:val="both"/>
-        <w:spacing w:before="40" w:after="140" w:line="276" w:lineRule="auto"/>
-        <w:ind w:left="400"/>
+        <w:spacing w:before="20" w:after="120" w:line="276" w:lineRule="auto"/>
+        <w:ind w:left="360"/>
       </w:pPr>
       <w:r>
         <w:rPr>
@@ -1028,7 +1088,7 @@
           <w:b/>
           <w:i/>
           <w:color w:val="374151"/>
-          <w:sz w:val="21"/>
+          <w:sz w:val="20"/>
         </w:rPr>
         <w:t xml:space="preserve">Resposta: </w:t>
       </w:r>
@@ -1037,9 +1097,9 @@
           <w:rFonts w:ascii="Arial" w:hAnsi="Arial"/>
           <w:i/>
           <w:color w:val="374151"/>
-          <w:sz w:val="21"/>
+          <w:sz w:val="20"/>
         </w:rPr>
-        <w:t>Computador no balcão da loja.</w:t>
+        <w:t>Status do WhatsApp, páginas institucionais no Facebook e a divulgação tradicional boca a boca com os clientes do bairro.</w:t>
       </w:r>
     </w:p>
     <w:p>
@@ -1052,25 +1112,25 @@
           <w:rFonts w:ascii="Arial" w:hAnsi="Arial"/>
           <w:b/>
           <w:color w:val="111827"/>
-          <w:sz w:val="22"/>
+          <w:sz w:val="21"/>
         </w:rPr>
-        <w:t xml:space="preserve">Pergunta 14: </w:t>
+        <w:t xml:space="preserve">Pergunta 18: </w:t>
       </w:r>
       <w:r>
         <w:rPr>
           <w:rFonts w:ascii="Arial" w:hAnsi="Arial"/>
           <w:b/>
           <w:color w:val="111827"/>
-          <w:sz w:val="22"/>
+          <w:sz w:val="21"/>
         </w:rPr>
-        <w:t>"Cada funcionário deveria ter um login próprio?"</w:t>
+        <w:t>"Vocês fazem trocas ou devoluções? Como isso é controlado?"</w:t>
       </w:r>
     </w:p>
     <w:p>
       <w:pPr>
         <w:jc w:val="both"/>
-        <w:spacing w:before="40" w:after="140" w:line="276" w:lineRule="auto"/>
-        <w:ind w:left="400"/>
+        <w:spacing w:before="20" w:after="120" w:line="276" w:lineRule="auto"/>
+        <w:ind w:left="360"/>
       </w:pPr>
       <w:r>
         <w:rPr>
@@ -1078,7 +1138,7 @@
           <w:b/>
           <w:i/>
           <w:color w:val="374151"/>
-          <w:sz w:val="21"/>
+          <w:sz w:val="20"/>
         </w:rPr>
         <w:t xml:space="preserve">Resposta: </w:t>
       </w:r>
@@ -1087,9 +1147,9 @@
           <w:rFonts w:ascii="Arial" w:hAnsi="Arial"/>
           <w:i/>
           <w:color w:val="374151"/>
-          <w:sz w:val="21"/>
+          <w:sz w:val="20"/>
         </w:rPr>
-        <w:t>Não é necessário um login para cada um na operação de vendas; um acesso geral de caixa e outro administrativo já atende.</w:t>
+        <w:t>Sim, realizamos o descarte e baixa do produto com avaria e fazemos a reposição imediata de um novo item para o cliente no balcão.</w:t>
       </w:r>
     </w:p>
     <w:p>
@@ -1102,25 +1162,25 @@
           <w:rFonts w:ascii="Arial" w:hAnsi="Arial"/>
           <w:b/>
           <w:color w:val="111827"/>
-          <w:sz w:val="22"/>
+          <w:sz w:val="21"/>
         </w:rPr>
-        <w:t xml:space="preserve">Pergunta 15: </w:t>
+        <w:t xml:space="preserve">Pergunta 19: </w:t>
       </w:r>
       <w:r>
         <w:rPr>
           <w:rFonts w:ascii="Arial" w:hAnsi="Arial"/>
           <w:b/>
           <w:color w:val="111827"/>
-          <w:sz w:val="22"/>
+          <w:sz w:val="21"/>
         </w:rPr>
-        <w:t>"Você gostaria de exportar relatórios (PDF ou Excel)?"</w:t>
+        <w:t>"Vocês utilizam algum sistema ou fazem tudo em papel/planilha?"</w:t>
       </w:r>
     </w:p>
     <w:p>
       <w:pPr>
         <w:jc w:val="both"/>
-        <w:spacing w:before="40" w:after="140" w:line="276" w:lineRule="auto"/>
-        <w:ind w:left="400"/>
+        <w:spacing w:before="20" w:after="120" w:line="276" w:lineRule="auto"/>
+        <w:ind w:left="360"/>
       </w:pPr>
       <w:r>
         <w:rPr>
@@ -1128,7 +1188,7 @@
           <w:b/>
           <w:i/>
           <w:color w:val="374151"/>
-          <w:sz w:val="21"/>
+          <w:sz w:val="20"/>
         </w:rPr>
         <w:t xml:space="preserve">Resposta: </w:t>
       </w:r>
@@ -1137,9 +1197,9 @@
           <w:rFonts w:ascii="Arial" w:hAnsi="Arial"/>
           <w:i/>
           <w:color w:val="374151"/>
-          <w:sz w:val="21"/>
+          <w:sz w:val="20"/>
         </w:rPr>
-        <w:t>Opcional (seria bom ter para fechamento, mas o foco é a tela).</w:t>
+        <w:t>Anotamos a maior parte das informações em cadernos e blocos de papel.</w:t>
       </w:r>
     </w:p>
     <w:p>
@@ -1152,25 +1212,25 @@
           <w:rFonts w:ascii="Arial" w:hAnsi="Arial"/>
           <w:b/>
           <w:color w:val="111827"/>
-          <w:sz w:val="22"/>
+          <w:sz w:val="21"/>
         </w:rPr>
-        <w:t xml:space="preserve">Pergunta 16: </w:t>
+        <w:t xml:space="preserve">Pergunta 20: </w:t>
       </w:r>
       <w:r>
         <w:rPr>
           <w:rFonts w:ascii="Arial" w:hAnsi="Arial"/>
           <w:b/>
           <w:color w:val="111827"/>
-          <w:sz w:val="22"/>
+          <w:sz w:val="21"/>
         </w:rPr>
-        <w:t>"Seria útil cadastrar fornecedores no sistema?"</w:t>
+        <w:t>"Vocês atendem apenas clientes físicos ou também empresas/escolas?"</w:t>
       </w:r>
     </w:p>
     <w:p>
       <w:pPr>
         <w:jc w:val="both"/>
-        <w:spacing w:before="40" w:after="140" w:line="276" w:lineRule="auto"/>
-        <w:ind w:left="400"/>
+        <w:spacing w:before="20" w:after="120" w:line="276" w:lineRule="auto"/>
+        <w:ind w:left="360"/>
       </w:pPr>
       <w:r>
         <w:rPr>
@@ -1178,7 +1238,7 @@
           <w:b/>
           <w:i/>
           <w:color w:val="374151"/>
-          <w:sz w:val="21"/>
+          <w:sz w:val="20"/>
         </w:rPr>
         <w:t xml:space="preserve">Resposta: </w:t>
       </w:r>
@@ -1187,24 +1247,9 @@
           <w:rFonts w:ascii="Arial" w:hAnsi="Arial"/>
           <w:i/>
           <w:color w:val="374151"/>
-          <w:sz w:val="21"/>
+          <w:sz w:val="20"/>
         </w:rPr>
-        <w:t>Sim, facilitaria saber de qual empresa ou distribuidor compramos cada mercadoria.</w:t>
-      </w:r>
-    </w:p>
-    <w:p>
-      <w:pPr>
-        <w:jc w:val="left"/>
-        <w:spacing w:before="240" w:after="100" w:line="276" w:lineRule="auto"/>
-      </w:pPr>
-      <w:r>
-        <w:rPr>
-          <w:rFonts w:ascii="Arial" w:hAnsi="Arial"/>
-          <w:b/>
-          <w:color w:val="000000"/>
-          <w:sz w:val="24"/>
-        </w:rPr>
-        <w:t>4. BLOCO 3: OPERAÇÃO COMERCIAL, VENDAS E ATENDIMENTO</w:t>
+        <w:t>Atendemos ambos: clientes individuais no balcão físico diariamente e pedidos sob encomenda de empresas e escolas da região.</w:t>
       </w:r>
     </w:p>
     <w:p>
@@ -1217,25 +1262,25 @@
           <w:rFonts w:ascii="Arial" w:hAnsi="Arial"/>
           <w:b/>
           <w:color w:val="111827"/>
-          <w:sz w:val="22"/>
+          <w:sz w:val="21"/>
         </w:rPr>
-        <w:t xml:space="preserve">Pergunta 17: </w:t>
+        <w:t xml:space="preserve">Pergunta 21: </w:t>
       </w:r>
       <w:r>
         <w:rPr>
           <w:rFonts w:ascii="Arial" w:hAnsi="Arial"/>
           <w:b/>
           <w:color w:val="111827"/>
-          <w:sz w:val="22"/>
+          <w:sz w:val="21"/>
         </w:rPr>
-        <w:t>"Quais são as principais estratégias de marketing da empresa?"</w:t>
+        <w:t>"Como é feito o controle de estoque?"</w:t>
       </w:r>
     </w:p>
     <w:p>
       <w:pPr>
         <w:jc w:val="both"/>
-        <w:spacing w:before="40" w:after="140" w:line="276" w:lineRule="auto"/>
-        <w:ind w:left="400"/>
+        <w:spacing w:before="20" w:after="120" w:line="276" w:lineRule="auto"/>
+        <w:ind w:left="360"/>
       </w:pPr>
       <w:r>
         <w:rPr>
@@ -1243,7 +1288,7 @@
           <w:b/>
           <w:i/>
           <w:color w:val="374151"/>
-          <w:sz w:val="21"/>
+          <w:sz w:val="20"/>
         </w:rPr>
         <w:t xml:space="preserve">Resposta: </w:t>
       </w:r>
@@ -1252,9 +1297,9 @@
           <w:rFonts w:ascii="Arial" w:hAnsi="Arial"/>
           <w:i/>
           <w:color w:val="374151"/>
-          <w:sz w:val="21"/>
+          <w:sz w:val="20"/>
         </w:rPr>
-        <w:t>Status do WhatsApp, página institucional no Facebook e divulgação boca a boca tradicional com os clientes do bairro.</w:t>
+        <w:t>Reposição realizada conforme observamos a falta dos produtos diretamente nas prateleiras e gôndolas.</w:t>
       </w:r>
     </w:p>
     <w:p>
@@ -1267,25 +1312,25 @@
           <w:rFonts w:ascii="Arial" w:hAnsi="Arial"/>
           <w:b/>
           <w:color w:val="111827"/>
-          <w:sz w:val="22"/>
+          <w:sz w:val="21"/>
         </w:rPr>
-        <w:t xml:space="preserve">Pergunta 18: </w:t>
+        <w:t xml:space="preserve">Pergunta 22: </w:t>
       </w:r>
       <w:r>
         <w:rPr>
           <w:rFonts w:ascii="Arial" w:hAnsi="Arial"/>
           <w:b/>
           <w:color w:val="111827"/>
-          <w:sz w:val="22"/>
+          <w:sz w:val="21"/>
         </w:rPr>
-        <w:t>"Vocês fazem trocas ou devoluções? Como isso é controlado?"</w:t>
+        <w:t>"Como vocês sabem quando precisam comprar mais produtos?"</w:t>
       </w:r>
     </w:p>
     <w:p>
       <w:pPr>
         <w:jc w:val="both"/>
-        <w:spacing w:before="40" w:after="140" w:line="276" w:lineRule="auto"/>
-        <w:ind w:left="400"/>
+        <w:spacing w:before="20" w:after="120" w:line="276" w:lineRule="auto"/>
+        <w:ind w:left="360"/>
       </w:pPr>
       <w:r>
         <w:rPr>
@@ -1293,7 +1338,7 @@
           <w:b/>
           <w:i/>
           <w:color w:val="374151"/>
-          <w:sz w:val="21"/>
+          <w:sz w:val="20"/>
         </w:rPr>
         <w:t xml:space="preserve">Resposta: </w:t>
       </w:r>
@@ -1302,9 +1347,9 @@
           <w:rFonts w:ascii="Arial" w:hAnsi="Arial"/>
           <w:i/>
           <w:color w:val="374151"/>
-          <w:sz w:val="21"/>
+          <w:sz w:val="20"/>
         </w:rPr>
-        <w:t>Sim, realizamos o descarte da mercadoria com avaria e a reposição do produto para o cliente no balcão.</w:t>
+        <w:t>Pela constatação visual direta da falta física do produto na área de vendas.</w:t>
       </w:r>
     </w:p>
     <w:p>
@@ -1317,25 +1362,25 @@
           <w:rFonts w:ascii="Arial" w:hAnsi="Arial"/>
           <w:b/>
           <w:color w:val="111827"/>
-          <w:sz w:val="22"/>
+          <w:sz w:val="21"/>
         </w:rPr>
-        <w:t xml:space="preserve">Pergunta 19: </w:t>
+        <w:t xml:space="preserve">Pergunta 23: </w:t>
       </w:r>
       <w:r>
         <w:rPr>
           <w:rFonts w:ascii="Arial" w:hAnsi="Arial"/>
           <w:b/>
           <w:color w:val="111827"/>
-          <w:sz w:val="22"/>
+          <w:sz w:val="21"/>
         </w:rPr>
-        <w:t>"Vocês utilizam algum sistema ou fazem tudo em papel/planilha?"</w:t>
+        <w:t>"Como registram as entradas de novos produtos no estoque?"</w:t>
       </w:r>
     </w:p>
     <w:p>
       <w:pPr>
         <w:jc w:val="both"/>
-        <w:spacing w:before="40" w:after="140" w:line="276" w:lineRule="auto"/>
-        <w:ind w:left="400"/>
+        <w:spacing w:before="20" w:after="120" w:line="276" w:lineRule="auto"/>
+        <w:ind w:left="360"/>
       </w:pPr>
       <w:r>
         <w:rPr>
@@ -1343,7 +1388,7 @@
           <w:b/>
           <w:i/>
           <w:color w:val="374151"/>
-          <w:sz w:val="21"/>
+          <w:sz w:val="20"/>
         </w:rPr>
         <w:t xml:space="preserve">Resposta: </w:t>
       </w:r>
@@ -1352,9 +1397,9 @@
           <w:rFonts w:ascii="Arial" w:hAnsi="Arial"/>
           <w:i/>
           <w:color w:val="374151"/>
-          <w:sz w:val="21"/>
+          <w:sz w:val="20"/>
         </w:rPr>
-        <w:t>Anotamos a maioria das coisas no papel.</w:t>
+        <w:t>Conferência manual da mercadoria dependendo do tipo e lançamento no momento em que a compra chega à loja.</w:t>
       </w:r>
     </w:p>
     <w:p>
@@ -1367,25 +1412,25 @@
           <w:rFonts w:ascii="Arial" w:hAnsi="Arial"/>
           <w:b/>
           <w:color w:val="111827"/>
-          <w:sz w:val="22"/>
+          <w:sz w:val="21"/>
         </w:rPr>
-        <w:t xml:space="preserve">Pergunta 20: </w:t>
+        <w:t xml:space="preserve">Pergunta 24: </w:t>
       </w:r>
       <w:r>
         <w:rPr>
           <w:rFonts w:ascii="Arial" w:hAnsi="Arial"/>
           <w:b/>
           <w:color w:val="111827"/>
-          <w:sz w:val="22"/>
+          <w:sz w:val="21"/>
         </w:rPr>
-        <w:t>"Vocês atendem apenas clientes físicos ou também empresas/escolas?"</w:t>
+        <w:t>"Aceitam quais formas de pagamento? (dinheiro, cartão, PIX, etc.)"</w:t>
       </w:r>
     </w:p>
     <w:p>
       <w:pPr>
         <w:jc w:val="both"/>
-        <w:spacing w:before="40" w:after="140" w:line="276" w:lineRule="auto"/>
-        <w:ind w:left="400"/>
+        <w:spacing w:before="20" w:after="120" w:line="276" w:lineRule="auto"/>
+        <w:ind w:left="360"/>
       </w:pPr>
       <w:r>
         <w:rPr>
@@ -1393,7 +1438,7 @@
           <w:b/>
           <w:i/>
           <w:color w:val="374151"/>
-          <w:sz w:val="21"/>
+          <w:sz w:val="20"/>
         </w:rPr>
         <w:t xml:space="preserve">Resposta: </w:t>
       </w:r>
@@ -1402,627 +1447,15 @@
           <w:rFonts w:ascii="Arial" w:hAnsi="Arial"/>
           <w:i/>
           <w:color w:val="374151"/>
-          <w:sz w:val="21"/>
+          <w:sz w:val="20"/>
         </w:rPr>
-        <w:t>Atendemos ambos: pessoas físicas no balcão diário e pedidos de empresas e escolas da região.</w:t>
+        <w:t>Aceitamos todas as formas citadas (dinheiro, cartão de débito, cartão de crédito e PIX), menos cheque.</w:t>
       </w:r>
     </w:p>
     <w:p>
       <w:pPr>
-        <w:jc w:val="both"/>
-        <w:spacing w:before="120" w:after="40" w:line="276" w:lineRule="auto"/>
-      </w:pPr>
-      <w:r>
-        <w:rPr>
-          <w:rFonts w:ascii="Arial" w:hAnsi="Arial"/>
-          <w:b/>
-          <w:color w:val="111827"/>
-          <w:sz w:val="22"/>
-        </w:rPr>
-        <w:t xml:space="preserve">Pergunta 21: </w:t>
-      </w:r>
-      <w:r>
-        <w:rPr>
-          <w:rFonts w:ascii="Arial" w:hAnsi="Arial"/>
-          <w:b/>
-          <w:color w:val="111827"/>
-          <w:sz w:val="22"/>
-        </w:rPr>
-        <w:t>"Como é feito o controle de estoque?"</w:t>
-      </w:r>
-    </w:p>
-    <w:p>
-      <w:pPr>
-        <w:jc w:val="both"/>
-        <w:spacing w:before="40" w:after="140" w:line="276" w:lineRule="auto"/>
-        <w:ind w:left="400"/>
-      </w:pPr>
-      <w:r>
-        <w:rPr>
-          <w:rFonts w:ascii="Arial" w:hAnsi="Arial"/>
-          <w:b/>
-          <w:i/>
-          <w:color w:val="374151"/>
-          <w:sz w:val="21"/>
-        </w:rPr>
-        <w:t xml:space="preserve">Resposta: </w:t>
-      </w:r>
-      <w:r>
-        <w:rPr>
-          <w:rFonts w:ascii="Arial" w:hAnsi="Arial"/>
-          <w:i/>
-          <w:color w:val="374151"/>
-          <w:sz w:val="21"/>
-        </w:rPr>
-        <w:t>Reposição conforme falta observada nas gôndolas.</w:t>
-      </w:r>
-    </w:p>
-    <w:p>
-      <w:pPr>
-        <w:jc w:val="both"/>
-        <w:spacing w:before="120" w:after="40" w:line="276" w:lineRule="auto"/>
-      </w:pPr>
-      <w:r>
-        <w:rPr>
-          <w:rFonts w:ascii="Arial" w:hAnsi="Arial"/>
-          <w:b/>
-          <w:color w:val="111827"/>
-          <w:sz w:val="22"/>
-        </w:rPr>
-        <w:t xml:space="preserve">Pergunta 22: </w:t>
-      </w:r>
-      <w:r>
-        <w:rPr>
-          <w:rFonts w:ascii="Arial" w:hAnsi="Arial"/>
-          <w:b/>
-          <w:color w:val="111827"/>
-          <w:sz w:val="22"/>
-        </w:rPr>
-        <w:t>"Como vocês sabem quando precisam comprar mais produtos?"</w:t>
-      </w:r>
-    </w:p>
-    <w:p>
-      <w:pPr>
-        <w:jc w:val="both"/>
-        <w:spacing w:before="40" w:after="140" w:line="276" w:lineRule="auto"/>
-        <w:ind w:left="400"/>
-      </w:pPr>
-      <w:r>
-        <w:rPr>
-          <w:rFonts w:ascii="Arial" w:hAnsi="Arial"/>
-          <w:b/>
-          <w:i/>
-          <w:color w:val="374151"/>
-          <w:sz w:val="21"/>
-        </w:rPr>
-        <w:t xml:space="preserve">Resposta: </w:t>
-      </w:r>
-      <w:r>
-        <w:rPr>
-          <w:rFonts w:ascii="Arial" w:hAnsi="Arial"/>
-          <w:i/>
-          <w:color w:val="374151"/>
-          <w:sz w:val="21"/>
-        </w:rPr>
-        <w:t>Pela constatação visual da falta do produto na prateleira.</w:t>
-      </w:r>
-    </w:p>
-    <w:p>
-      <w:pPr>
-        <w:jc w:val="both"/>
-        <w:spacing w:before="120" w:after="40" w:line="276" w:lineRule="auto"/>
-      </w:pPr>
-      <w:r>
-        <w:rPr>
-          <w:rFonts w:ascii="Arial" w:hAnsi="Arial"/>
-          <w:b/>
-          <w:color w:val="111827"/>
-          <w:sz w:val="22"/>
-        </w:rPr>
-        <w:t xml:space="preserve">Pergunta 23: </w:t>
-      </w:r>
-      <w:r>
-        <w:rPr>
-          <w:rFonts w:ascii="Arial" w:hAnsi="Arial"/>
-          <w:b/>
-          <w:color w:val="111827"/>
-          <w:sz w:val="22"/>
-        </w:rPr>
-        <w:t>"Como registram as entradas de novos produtos no estoque?"</w:t>
-      </w:r>
-    </w:p>
-    <w:p>
-      <w:pPr>
-        <w:jc w:val="both"/>
-        <w:spacing w:before="40" w:after="140" w:line="276" w:lineRule="auto"/>
-        <w:ind w:left="400"/>
-      </w:pPr>
-      <w:r>
-        <w:rPr>
-          <w:rFonts w:ascii="Arial" w:hAnsi="Arial"/>
-          <w:b/>
-          <w:i/>
-          <w:color w:val="374151"/>
-          <w:sz w:val="21"/>
-        </w:rPr>
-        <w:t xml:space="preserve">Resposta: </w:t>
-      </w:r>
-      <w:r>
-        <w:rPr>
-          <w:rFonts w:ascii="Arial" w:hAnsi="Arial"/>
-          <w:i/>
-          <w:color w:val="374151"/>
-          <w:sz w:val="21"/>
-        </w:rPr>
-        <w:t>Cadastro do produto dependendo do tipo e lançamento manual conforme a mercadoria chega.</w:t>
-      </w:r>
-    </w:p>
-    <w:p>
-      <w:pPr>
-        <w:jc w:val="both"/>
-        <w:spacing w:before="120" w:after="40" w:line="276" w:lineRule="auto"/>
-      </w:pPr>
-      <w:r>
-        <w:rPr>
-          <w:rFonts w:ascii="Arial" w:hAnsi="Arial"/>
-          <w:b/>
-          <w:color w:val="111827"/>
-          <w:sz w:val="22"/>
-        </w:rPr>
-        <w:t xml:space="preserve">Pergunta 24: </w:t>
-      </w:r>
-      <w:r>
-        <w:rPr>
-          <w:rFonts w:ascii="Arial" w:hAnsi="Arial"/>
-          <w:b/>
-          <w:color w:val="111827"/>
-          <w:sz w:val="22"/>
-        </w:rPr>
-        <w:t>"Aceitam quais formas de pagamento? (dinheiro, cartão, PIX, etc.)"</w:t>
-      </w:r>
-    </w:p>
-    <w:p>
-      <w:pPr>
-        <w:jc w:val="both"/>
-        <w:spacing w:before="40" w:after="140" w:line="276" w:lineRule="auto"/>
-        <w:ind w:left="400"/>
-      </w:pPr>
-      <w:r>
-        <w:rPr>
-          <w:rFonts w:ascii="Arial" w:hAnsi="Arial"/>
-          <w:b/>
-          <w:i/>
-          <w:color w:val="374151"/>
-          <w:sz w:val="21"/>
-        </w:rPr>
-        <w:t xml:space="preserve">Resposta: </w:t>
-      </w:r>
-      <w:r>
-        <w:rPr>
-          <w:rFonts w:ascii="Arial" w:hAnsi="Arial"/>
-          <w:i/>
-          <w:color w:val="374151"/>
-          <w:sz w:val="21"/>
-        </w:rPr>
-        <w:t>Todas as formas citadas (dinheiro, cartão de débito, cartão de crédito e PIX), menos cheque.</w:t>
-      </w:r>
-    </w:p>
-    <w:p>
-      <w:pPr>
-        <w:jc w:val="left"/>
-        <w:spacing w:before="240" w:after="100" w:line="276" w:lineRule="auto"/>
-      </w:pPr>
-      <w:r>
-        <w:rPr>
-          <w:rFonts w:ascii="Arial" w:hAnsi="Arial"/>
-          <w:b/>
-          <w:color w:val="000000"/>
-          <w:sz w:val="24"/>
-        </w:rPr>
-        <w:t>5. SÍNTESE DOS REQUISITOS TÉCNICOS DERIVADOS PARA O MRSTOCK ERP</w:t>
-      </w:r>
-    </w:p>
-    <w:p>
-      <w:pPr>
-        <w:jc w:val="both"/>
-        <w:spacing w:before="60" w:after="100" w:line="276" w:lineRule="auto"/>
-      </w:pPr>
-      <w:r>
-        <w:rPr>
-          <w:rFonts w:ascii="Arial" w:hAnsi="Arial"/>
-          <w:color w:val="111827"/>
-          <w:sz w:val="22"/>
-        </w:rPr>
-        <w:t>A partir da análise das respostas fornecidas pela Papelaria Real Ltda, a equipe técnica estruturou o backlog de desenvolvimento do MrStock ERP em módulos correspondentes às demandas reais:</w:t>
-      </w:r>
-    </w:p>
-    <w:tbl>
-      <w:tblPr>
-        <w:tblW w:type="auto" w:w="0"/>
         <w:jc w:val="center"/>
-        <w:tblLayout w:type="fixed"/>
-        <w:tblLook w:firstColumn="1" w:firstRow="1" w:lastColumn="0" w:lastRow="0" w:noHBand="0" w:noVBand="1" w:val="04A0"/>
-        <w:tblBorders>
-          <w:top w:val="single" w:sz="4" w:space="0" w:color="D1D5DB"/>
-          <w:bottom w:val="single" w:sz="4" w:space="0" w:color="D1D5DB"/>
-          <w:insideH w:val="single" w:sz="4" w:space="0" w:color="E5E7EB"/>
-          <w:insideV w:val="none"/>
-          <w:left w:val="none"/>
-          <w:right w:val="none"/>
-        </w:tblBorders>
-      </w:tblPr>
-      <w:tblGrid>
-        <w:gridCol w:w="3135"/>
-        <w:gridCol w:w="3135"/>
-        <w:gridCol w:w="3135"/>
-      </w:tblGrid>
-      <w:tr>
-        <w:tc>
-          <w:tcPr>
-            <w:tcW w:type="dxa" w:w="3312"/>
-            <w:shd w:fill="1F2937"/>
-          </w:tcPr>
-          <w:p>
-            <w:pPr>
-              <w:jc w:val="left"/>
-            </w:pPr>
-            <w:r>
-              <w:rPr>
-                <w:rFonts w:ascii="Arial" w:hAnsi="Arial"/>
-                <w:b/>
-                <w:color w:val="FFFFFF"/>
-                <w:sz w:val="19"/>
-              </w:rPr>
-              <w:t>Demanda Diagnosticada na Entrevista</w:t>
-            </w:r>
-          </w:p>
-        </w:tc>
-        <w:tc>
-          <w:tcPr>
-            <w:tcW w:type="dxa" w:w="3312"/>
-            <w:shd w:fill="1F2937"/>
-          </w:tcPr>
-          <w:p>
-            <w:pPr>
-              <w:jc w:val="left"/>
-            </w:pPr>
-            <w:r>
-              <w:rPr>
-                <w:rFonts w:ascii="Arial" w:hAnsi="Arial"/>
-                <w:b/>
-                <w:color w:val="FFFFFF"/>
-                <w:sz w:val="19"/>
-              </w:rPr>
-              <w:t>Módulo Desenvolvido no MrStock ERP</w:t>
-            </w:r>
-          </w:p>
-        </w:tc>
-        <w:tc>
-          <w:tcPr>
-            <w:tcW w:type="dxa" w:w="3168"/>
-            <w:shd w:fill="1F2937"/>
-          </w:tcPr>
-          <w:p>
-            <w:pPr>
-              <w:jc w:val="left"/>
-            </w:pPr>
-            <w:r>
-              <w:rPr>
-                <w:rFonts w:ascii="Arial" w:hAnsi="Arial"/>
-                <w:b/>
-                <w:color w:val="FFFFFF"/>
-                <w:sz w:val="19"/>
-              </w:rPr>
-              <w:t>Impacto Operacional no Comércio</w:t>
-            </w:r>
-          </w:p>
-        </w:tc>
-      </w:tr>
-      <w:tr>
-        <w:tc>
-          <w:tcPr>
-            <w:tcW w:type="dxa" w:w="3312"/>
-            <w:shd w:fill="F9FAFB"/>
-          </w:tcPr>
-          <w:p>
-            <w:pPr>
-              <w:jc w:val="left"/>
-            </w:pPr>
-            <w:r>
-              <w:rPr>
-                <w:rFonts w:ascii="Arial" w:hAnsi="Arial"/>
-                <w:color w:val="1F2937"/>
-                <w:sz w:val="18"/>
-              </w:rPr>
-              <w:t>Controle de vencimento de itens químicos (tintas, colas, massinhas)</w:t>
-            </w:r>
-          </w:p>
-        </w:tc>
-        <w:tc>
-          <w:tcPr>
-            <w:tcW w:type="dxa" w:w="3312"/>
-            <w:shd w:fill="F9FAFB"/>
-          </w:tcPr>
-          <w:p>
-            <w:pPr>
-              <w:jc w:val="left"/>
-            </w:pPr>
-            <w:r>
-              <w:rPr>
-                <w:rFonts w:ascii="Arial" w:hAnsi="Arial"/>
-                <w:color w:val="1F2937"/>
-                <w:sz w:val="18"/>
-              </w:rPr>
-              <w:t>Módulo de Lotes, Validades e Alerta Visual de 30 Dias</w:t>
-            </w:r>
-          </w:p>
-        </w:tc>
-        <w:tc>
-          <w:tcPr>
-            <w:tcW w:type="dxa" w:w="3168"/>
-            <w:shd w:fill="F9FAFB"/>
-          </w:tcPr>
-          <w:p>
-            <w:pPr>
-              <w:jc w:val="left"/>
-            </w:pPr>
-            <w:r>
-              <w:rPr>
-                <w:rFonts w:ascii="Arial" w:hAnsi="Arial"/>
-                <w:color w:val="1F2937"/>
-                <w:sz w:val="18"/>
-              </w:rPr>
-              <w:t>Erradicação de perdas financeiras por expiração de shelf-life com triagem PEPS/FIFO.</w:t>
-            </w:r>
-          </w:p>
-        </w:tc>
-      </w:tr>
-      <w:tr>
-        <w:tc>
-          <w:tcPr>
-            <w:tcW w:type="dxa" w:w="3312"/>
-            <w:shd w:fill="FFFFFF"/>
-          </w:tcPr>
-          <w:p>
-            <w:pPr>
-              <w:jc w:val="left"/>
-            </w:pPr>
-            <w:r>
-              <w:rPr>
-                <w:rFonts w:ascii="Arial" w:hAnsi="Arial"/>
-                <w:color w:val="1F2937"/>
-                <w:sz w:val="18"/>
-              </w:rPr>
-              <w:t>Organização por categorias físicas de uso da papelaria</w:t>
-            </w:r>
-          </w:p>
-        </w:tc>
-        <w:tc>
-          <w:tcPr>
-            <w:tcW w:type="dxa" w:w="3312"/>
-            <w:shd w:fill="FFFFFF"/>
-          </w:tcPr>
-          <w:p>
-            <w:pPr>
-              <w:jc w:val="left"/>
-            </w:pPr>
-            <w:r>
-              <w:rPr>
-                <w:rFonts w:ascii="Arial" w:hAnsi="Arial"/>
-                <w:color w:val="1F2937"/>
-                <w:sz w:val="18"/>
-              </w:rPr>
-              <w:t>Estrutura das 10 Famílias Funcionais da Papelaria Real</w:t>
-            </w:r>
-          </w:p>
-        </w:tc>
-        <w:tc>
-          <w:tcPr>
-            <w:tcW w:type="dxa" w:w="3168"/>
-            <w:shd w:fill="FFFFFF"/>
-          </w:tcPr>
-          <w:p>
-            <w:pPr>
-              <w:jc w:val="left"/>
-            </w:pPr>
-            <w:r>
-              <w:rPr>
-                <w:rFonts w:ascii="Arial" w:hAnsi="Arial"/>
-                <w:color w:val="1F2937"/>
-                <w:sz w:val="18"/>
-              </w:rPr>
-              <w:t>Localização instantânea de itens escolares no catálogo sem distorções na Curva ABC.</w:t>
-            </w:r>
-          </w:p>
-        </w:tc>
-      </w:tr>
-      <w:tr>
-        <w:tc>
-          <w:tcPr>
-            <w:tcW w:type="dxa" w:w="3312"/>
-            <w:shd w:fill="F9FAFB"/>
-          </w:tcPr>
-          <w:p>
-            <w:pPr>
-              <w:jc w:val="left"/>
-            </w:pPr>
-            <w:r>
-              <w:rPr>
-                <w:rFonts w:ascii="Arial" w:hAnsi="Arial"/>
-                <w:color w:val="1F2937"/>
-                <w:sz w:val="18"/>
-              </w:rPr>
-              <w:t>Registro ágil de vendas com múltiplas formas de pagamento</w:t>
-            </w:r>
-          </w:p>
-        </w:tc>
-        <w:tc>
-          <w:tcPr>
-            <w:tcW w:type="dxa" w:w="3312"/>
-            <w:shd w:fill="F9FAFB"/>
-          </w:tcPr>
-          <w:p>
-            <w:pPr>
-              <w:jc w:val="left"/>
-            </w:pPr>
-            <w:r>
-              <w:rPr>
-                <w:rFonts w:ascii="Arial" w:hAnsi="Arial"/>
-                <w:color w:val="1F2937"/>
-                <w:sz w:val="18"/>
-              </w:rPr>
-              <w:t>Ponto de Venda (PDV) com Teclas de Atalho e Cálculo de Troco</w:t>
-            </w:r>
-          </w:p>
-        </w:tc>
-        <w:tc>
-          <w:tcPr>
-            <w:tcW w:type="dxa" w:w="3168"/>
-            <w:shd w:fill="F9FAFB"/>
-          </w:tcPr>
-          <w:p>
-            <w:pPr>
-              <w:jc w:val="left"/>
-            </w:pPr>
-            <w:r>
-              <w:rPr>
-                <w:rFonts w:ascii="Arial" w:hAnsi="Arial"/>
-                <w:color w:val="1F2937"/>
-                <w:sz w:val="18"/>
-              </w:rPr>
-              <w:t>Atendimento rápido em horários de pico escolar sem formação de filas no caixa.</w:t>
-            </w:r>
-          </w:p>
-        </w:tc>
-      </w:tr>
-      <w:tr>
-        <w:tc>
-          <w:tcPr>
-            <w:tcW w:type="dxa" w:w="3312"/>
-            <w:shd w:fill="FFFFFF"/>
-          </w:tcPr>
-          <w:p>
-            <w:pPr>
-              <w:jc w:val="left"/>
-            </w:pPr>
-            <w:r>
-              <w:rPr>
-                <w:rFonts w:ascii="Arial" w:hAnsi="Arial"/>
-                <w:color w:val="1F2937"/>
-                <w:sz w:val="18"/>
-              </w:rPr>
-              <w:t>Identificação de parceiros de reposição comercial</w:t>
-            </w:r>
-          </w:p>
-        </w:tc>
-        <w:tc>
-          <w:tcPr>
-            <w:tcW w:type="dxa" w:w="3312"/>
-            <w:shd w:fill="FFFFFF"/>
-          </w:tcPr>
-          <w:p>
-            <w:pPr>
-              <w:jc w:val="left"/>
-            </w:pPr>
-            <w:r>
-              <w:rPr>
-                <w:rFonts w:ascii="Arial" w:hAnsi="Arial"/>
-                <w:color w:val="1F2937"/>
-                <w:sz w:val="18"/>
-              </w:rPr>
-              <w:t>Módulo de Gestão de Fornecedores com Disparo WhatsApp</w:t>
-            </w:r>
-          </w:p>
-        </w:tc>
-        <w:tc>
-          <w:tcPr>
-            <w:tcW w:type="dxa" w:w="3168"/>
-            <w:shd w:fill="FFFFFF"/>
-          </w:tcPr>
-          <w:p>
-            <w:pPr>
-              <w:jc w:val="left"/>
-            </w:pPr>
-            <w:r>
-              <w:rPr>
-                <w:rFonts w:ascii="Arial" w:hAnsi="Arial"/>
-                <w:color w:val="1F2937"/>
-                <w:sz w:val="18"/>
-              </w:rPr>
-              <w:t>Agilidade no contato direto com distribuidores (Tilibra, Chamex, Faber-Castell).</w:t>
-            </w:r>
-          </w:p>
-        </w:tc>
-      </w:tr>
-      <w:tr>
-        <w:tc>
-          <w:tcPr>
-            <w:tcW w:type="dxa" w:w="3312"/>
-            <w:shd w:fill="F9FAFB"/>
-          </w:tcPr>
-          <w:p>
-            <w:pPr>
-              <w:jc w:val="left"/>
-            </w:pPr>
-            <w:r>
-              <w:rPr>
-                <w:rFonts w:ascii="Arial" w:hAnsi="Arial"/>
-                <w:color w:val="1F2937"/>
-                <w:sz w:val="18"/>
-              </w:rPr>
-              <w:t>Substituição de anotações em papel por registro digital</w:t>
-            </w:r>
-          </w:p>
-        </w:tc>
-        <w:tc>
-          <w:tcPr>
-            <w:tcW w:type="dxa" w:w="3312"/>
-            <w:shd w:fill="F9FAFB"/>
-          </w:tcPr>
-          <w:p>
-            <w:pPr>
-              <w:jc w:val="left"/>
-            </w:pPr>
-            <w:r>
-              <w:rPr>
-                <w:rFonts w:ascii="Arial" w:hAnsi="Arial"/>
-                <w:color w:val="1F2937"/>
-                <w:sz w:val="18"/>
-              </w:rPr>
-              <w:t>Painel de Movimentações Kardex e Relatórios Gerenciais</w:t>
-            </w:r>
-          </w:p>
-        </w:tc>
-        <w:tc>
-          <w:tcPr>
-            <w:tcW w:type="dxa" w:w="3168"/>
-            <w:shd w:fill="F9FAFB"/>
-          </w:tcPr>
-          <w:p>
-            <w:pPr>
-              <w:jc w:val="left"/>
-            </w:pPr>
-            <w:r>
-              <w:rPr>
-                <w:rFonts w:ascii="Arial" w:hAnsi="Arial"/>
-                <w:color w:val="1F2937"/>
-                <w:sz w:val="18"/>
-              </w:rPr>
-              <w:t>Rastreabilidade forense de todas as entradas, saídas e ajustes de balcão.</w:t>
-            </w:r>
-          </w:p>
-        </w:tc>
-      </w:tr>
-    </w:tbl>
-    <w:p>
-      <w:pPr>
-        <w:jc w:val="left"/>
-        <w:spacing w:before="140" w:after="140" w:line="276" w:lineRule="auto"/>
-      </w:pPr>
-    </w:p>
-    <w:p>
-      <w:pPr>
-        <w:jc w:val="center"/>
+        <w:spacing w:before="240" w:after="160" w:line="276" w:lineRule="auto"/>
       </w:pPr>
       <w:r>
         <w:rPr>
@@ -2030,7 +1463,7 @@
           <w:color w:val="4B5563"/>
           <w:sz w:val="20"/>
         </w:rPr>
-        <w:t>Sorocaba/SP, Setembro de 2026.</w:t>
+        <w:t>Sorocaba – SP, Setembro de 2026.</w:t>
         <w:br/>
         <w:br/>
       </w:r>

</xml_diff>